<commit_message>
refactor(ui): Phase 2-3 - chuẩn hóa strings.xml, dimen tokens, button styles, accessibility
- Trích xuất toàn bộ hardcoded strings sang strings.xml (Login, Register, Profile, EditProfile, Health CRUD)
- Thay thế hardcoded dp/sp bằng @dimen/ tokens trong activity_add_health.xml
- Áp dụng Widget.Vita.Button.Primary cho nút lưu, loại bỏ textAllCaps
- Thêm navigationContentDescription cho 5 toolbar (TalkBack)
- Trích xuất context menu titles sang @string/
- Fix format positional trong strings.xml (edit_profile_error_invalid_water_goal)
- Build & unit tests passed
</commit_message>
<xml_diff>
--- a/Tai_lieu/Chương/Chuong_1.docx
+++ b/Tai_lieu/Chương/Chuong_1.docx
@@ -805,6 +805,38 @@
     </w:p>
     <w:p>
       <w:pPr>
+        <w:tabs>
+          <w:tab w:val="left" w:pos="2805"/>
+        </w:tabs>
+        <w:spacing w:line="276" w:lineRule="auto"/>
+        <w:jc w:val="center"/>
+        <w:rPr>
+          <w:rFonts w:cstheme="majorHAnsi"/>
+          <w:b/>
+          <w:sz w:val="28"/>
+          <w:szCs w:val="28"/>
+          <w:lang w:val="en-US"/>
+        </w:rPr>
+      </w:pPr>
+    </w:p>
+    <w:p>
+      <w:pPr>
+        <w:tabs>
+          <w:tab w:val="left" w:pos="2805"/>
+        </w:tabs>
+        <w:spacing w:line="276" w:lineRule="auto"/>
+        <w:jc w:val="center"/>
+        <w:rPr>
+          <w:rFonts w:cstheme="majorHAnsi"/>
+          <w:b/>
+          <w:sz w:val="28"/>
+          <w:szCs w:val="28"/>
+          <w:lang w:val="en-US"/>
+        </w:rPr>
+      </w:pPr>
+    </w:p>
+    <w:p>
+      <w:pPr>
         <w:jc w:val="center"/>
         <w:rPr>
           <w:rFonts w:cstheme="majorHAnsi"/>
@@ -1682,6 +1714,18 @@
           <w:lang w:val="en-US"/>
         </w:rPr>
       </w:pPr>
+    </w:p>
+    <w:p>
+      <w:pPr>
+        <w:jc w:val="center"/>
+        <w:rPr>
+          <w:rFonts w:cstheme="majorHAnsi"/>
+          <w:b/>
+          <w:bCs/>
+          <w:szCs w:val="26"/>
+          <w:lang w:val="en-US"/>
+        </w:rPr>
+      </w:pPr>
       <w:r>
         <w:rPr>
           <w:rFonts w:cstheme="majorHAnsi"/>
@@ -5742,6 +5786,7 @@
       <w:r>
         <w:rPr>
           <w:rFonts w:cstheme="majorHAnsi"/>
+          <w:noProof/>
           <w:lang w:val="en-US"/>
         </w:rPr>
         <w:lastRenderedPageBreak/>
@@ -7416,6 +7461,7 @@
       <w:r>
         <w:rPr>
           <w:rFonts w:cstheme="majorHAnsi"/>
+          <w:noProof/>
           <w:lang w:val="en-US"/>
         </w:rPr>
         <w:lastRenderedPageBreak/>
@@ -7748,13 +7794,7 @@
         <w:rPr>
           <w:lang w:val="en-US"/>
         </w:rPr>
-        <w:t xml:space="preserve"> Thiết lập chỉ mục tổng hợp (Composite Index) trên bộ đôi (user_id, date) cho 3 bảng nhật ký thường xuyên phát sinh truy vấn: health_records, water_logs và sleep_logs.</w:t>
-      </w:r>
-      <w:r>
-        <w:rPr>
-          <w:lang w:val="en-US"/>
-        </w:rPr>
-        <w:t xml:space="preserve"> </w:t>
+        <w:t xml:space="preserve"> Thiết lập chỉ mục tổng hợp (Composite Index) trên bộ đôi (user_id, date) cho 3 bảng nhật ký thường xuyên phát sinh truy vấn: health_records, water_logs và sleep_logs. </w:t>
       </w:r>
     </w:p>
     <w:p>
@@ -9149,7 +9189,7 @@
           </w:tcPr>
           <w:p>
             <w:pPr>
-              <w:jc w:val="left"/>
+              <w:jc w:val="center"/>
               <w:rPr>
                 <w:rFonts w:cstheme="majorHAnsi"/>
                 <w:b/>
@@ -9255,7 +9295,7 @@
           </w:tcPr>
           <w:p>
             <w:pPr>
-              <w:jc w:val="left"/>
+              <w:jc w:val="center"/>
               <w:rPr>
                 <w:rFonts w:cstheme="majorHAnsi"/>
                 <w:b/>
@@ -9361,7 +9401,7 @@
           </w:tcPr>
           <w:p>
             <w:pPr>
-              <w:jc w:val="left"/>
+              <w:jc w:val="center"/>
               <w:rPr>
                 <w:rFonts w:cstheme="majorHAnsi"/>
                 <w:b/>
@@ -9467,7 +9507,7 @@
           </w:tcPr>
           <w:p>
             <w:pPr>
-              <w:jc w:val="left"/>
+              <w:jc w:val="center"/>
               <w:rPr>
                 <w:rFonts w:cstheme="majorHAnsi"/>
                 <w:b/>
@@ -9566,7 +9606,7 @@
           </w:tcPr>
           <w:p>
             <w:pPr>
-              <w:jc w:val="left"/>
+              <w:jc w:val="center"/>
               <w:rPr>
                 <w:rFonts w:cstheme="majorHAnsi"/>
                 <w:b/>
@@ -9665,7 +9705,7 @@
           </w:tcPr>
           <w:p>
             <w:pPr>
-              <w:jc w:val="left"/>
+              <w:jc w:val="center"/>
               <w:rPr>
                 <w:rFonts w:cstheme="majorHAnsi"/>
                 <w:b/>
@@ -9764,7 +9804,7 @@
           </w:tcPr>
           <w:p>
             <w:pPr>
-              <w:jc w:val="left"/>
+              <w:jc w:val="center"/>
               <w:rPr>
                 <w:rFonts w:cstheme="majorHAnsi"/>
                 <w:b/>
@@ -9863,7 +9903,7 @@
           </w:tcPr>
           <w:p>
             <w:pPr>
-              <w:jc w:val="left"/>
+              <w:jc w:val="center"/>
               <w:rPr>
                 <w:rFonts w:cstheme="majorHAnsi"/>
                 <w:b/>
@@ -9962,7 +10002,7 @@
           </w:tcPr>
           <w:p>
             <w:pPr>
-              <w:jc w:val="left"/>
+              <w:jc w:val="center"/>
               <w:rPr>
                 <w:rFonts w:cstheme="majorHAnsi"/>
                 <w:b/>
@@ -10218,7 +10258,7 @@
           </w:tcPr>
           <w:p>
             <w:pPr>
-              <w:jc w:val="left"/>
+              <w:jc w:val="center"/>
               <w:rPr>
                 <w:rFonts w:cstheme="majorHAnsi"/>
                 <w:b/>
@@ -10324,7 +10364,7 @@
           </w:tcPr>
           <w:p>
             <w:pPr>
-              <w:jc w:val="left"/>
+              <w:jc w:val="center"/>
               <w:rPr>
                 <w:rFonts w:cstheme="majorHAnsi"/>
                 <w:b/>
@@ -10430,7 +10470,7 @@
           </w:tcPr>
           <w:p>
             <w:pPr>
-              <w:jc w:val="left"/>
+              <w:jc w:val="center"/>
               <w:rPr>
                 <w:rFonts w:cstheme="majorHAnsi"/>
                 <w:b/>
@@ -10536,7 +10576,7 @@
           </w:tcPr>
           <w:p>
             <w:pPr>
-              <w:jc w:val="left"/>
+              <w:jc w:val="center"/>
               <w:rPr>
                 <w:rFonts w:cstheme="majorHAnsi"/>
                 <w:b/>
@@ -10635,7 +10675,7 @@
           </w:tcPr>
           <w:p>
             <w:pPr>
-              <w:jc w:val="left"/>
+              <w:jc w:val="center"/>
               <w:rPr>
                 <w:rFonts w:cstheme="majorHAnsi"/>
                 <w:b/>
@@ -10741,7 +10781,7 @@
           </w:tcPr>
           <w:p>
             <w:pPr>
-              <w:jc w:val="left"/>
+              <w:jc w:val="center"/>
               <w:rPr>
                 <w:rFonts w:cstheme="majorHAnsi"/>
                 <w:b/>
@@ -10847,7 +10887,7 @@
           </w:tcPr>
           <w:p>
             <w:pPr>
-              <w:jc w:val="left"/>
+              <w:jc w:val="center"/>
               <w:rPr>
                 <w:rFonts w:cstheme="majorHAnsi"/>
                 <w:b/>
@@ -11104,10 +11144,11 @@
         <w:tc>
           <w:tcPr>
             <w:tcW w:w="1414" w:type="dxa"/>
-          </w:tcPr>
-          <w:p>
-            <w:pPr>
-              <w:jc w:val="left"/>
+            <w:vAlign w:val="center"/>
+          </w:tcPr>
+          <w:p>
+            <w:pPr>
+              <w:jc w:val="center"/>
               <w:rPr>
                 <w:rFonts w:cstheme="majorHAnsi"/>
                 <w:b/>
@@ -11129,6 +11170,7 @@
         <w:tc>
           <w:tcPr>
             <w:tcW w:w="1485" w:type="dxa"/>
+            <w:vAlign w:val="center"/>
           </w:tcPr>
           <w:p>
             <w:pPr>
@@ -11154,6 +11196,7 @@
         <w:tc>
           <w:tcPr>
             <w:tcW w:w="2542" w:type="dxa"/>
+            <w:vAlign w:val="center"/>
           </w:tcPr>
           <w:p>
             <w:pPr>
@@ -11179,6 +11222,7 @@
         <w:tc>
           <w:tcPr>
             <w:tcW w:w="3733" w:type="dxa"/>
+            <w:vAlign w:val="center"/>
           </w:tcPr>
           <w:p>
             <w:pPr>
@@ -11206,10 +11250,11 @@
         <w:tc>
           <w:tcPr>
             <w:tcW w:w="1414" w:type="dxa"/>
-          </w:tcPr>
-          <w:p>
-            <w:pPr>
-              <w:jc w:val="left"/>
+            <w:vAlign w:val="center"/>
+          </w:tcPr>
+          <w:p>
+            <w:pPr>
+              <w:jc w:val="center"/>
               <w:rPr>
                 <w:rFonts w:cstheme="majorHAnsi"/>
                 <w:b/>
@@ -11231,6 +11276,7 @@
         <w:tc>
           <w:tcPr>
             <w:tcW w:w="1485" w:type="dxa"/>
+            <w:vAlign w:val="center"/>
           </w:tcPr>
           <w:p>
             <w:pPr>
@@ -11256,6 +11302,7 @@
         <w:tc>
           <w:tcPr>
             <w:tcW w:w="2542" w:type="dxa"/>
+            <w:vAlign w:val="center"/>
           </w:tcPr>
           <w:p>
             <w:pPr>
@@ -11281,6 +11328,7 @@
         <w:tc>
           <w:tcPr>
             <w:tcW w:w="3733" w:type="dxa"/>
+            <w:vAlign w:val="center"/>
           </w:tcPr>
           <w:p>
             <w:pPr>
@@ -11308,10 +11356,11 @@
         <w:tc>
           <w:tcPr>
             <w:tcW w:w="1414" w:type="dxa"/>
-          </w:tcPr>
-          <w:p>
-            <w:pPr>
-              <w:jc w:val="left"/>
+            <w:vAlign w:val="center"/>
+          </w:tcPr>
+          <w:p>
+            <w:pPr>
+              <w:jc w:val="center"/>
               <w:rPr>
                 <w:rFonts w:cstheme="majorHAnsi"/>
                 <w:b/>
@@ -11333,6 +11382,7 @@
         <w:tc>
           <w:tcPr>
             <w:tcW w:w="1485" w:type="dxa"/>
+            <w:vAlign w:val="center"/>
           </w:tcPr>
           <w:p>
             <w:pPr>
@@ -11358,6 +11408,7 @@
         <w:tc>
           <w:tcPr>
             <w:tcW w:w="2542" w:type="dxa"/>
+            <w:vAlign w:val="center"/>
           </w:tcPr>
           <w:p>
             <w:pPr>
@@ -11383,6 +11434,7 @@
         <w:tc>
           <w:tcPr>
             <w:tcW w:w="3733" w:type="dxa"/>
+            <w:vAlign w:val="center"/>
           </w:tcPr>
           <w:p>
             <w:pPr>
@@ -11410,10 +11462,11 @@
         <w:tc>
           <w:tcPr>
             <w:tcW w:w="1414" w:type="dxa"/>
-          </w:tcPr>
-          <w:p>
-            <w:pPr>
-              <w:jc w:val="left"/>
+            <w:vAlign w:val="center"/>
+          </w:tcPr>
+          <w:p>
+            <w:pPr>
+              <w:jc w:val="center"/>
               <w:rPr>
                 <w:rFonts w:cstheme="majorHAnsi"/>
                 <w:b/>
@@ -11435,6 +11488,7 @@
         <w:tc>
           <w:tcPr>
             <w:tcW w:w="1485" w:type="dxa"/>
+            <w:vAlign w:val="center"/>
           </w:tcPr>
           <w:p>
             <w:pPr>
@@ -11460,6 +11514,7 @@
         <w:tc>
           <w:tcPr>
             <w:tcW w:w="2542" w:type="dxa"/>
+            <w:vAlign w:val="center"/>
           </w:tcPr>
           <w:p>
             <w:pPr>
@@ -11485,6 +11540,7 @@
         <w:tc>
           <w:tcPr>
             <w:tcW w:w="3733" w:type="dxa"/>
+            <w:vAlign w:val="center"/>
           </w:tcPr>
           <w:p>
             <w:pPr>
@@ -11512,10 +11568,11 @@
         <w:tc>
           <w:tcPr>
             <w:tcW w:w="1414" w:type="dxa"/>
-          </w:tcPr>
-          <w:p>
-            <w:pPr>
-              <w:jc w:val="left"/>
+            <w:vAlign w:val="center"/>
+          </w:tcPr>
+          <w:p>
+            <w:pPr>
+              <w:jc w:val="center"/>
               <w:rPr>
                 <w:rFonts w:cstheme="majorHAnsi"/>
                 <w:b/>
@@ -11538,6 +11595,7 @@
         <w:tc>
           <w:tcPr>
             <w:tcW w:w="1485" w:type="dxa"/>
+            <w:vAlign w:val="center"/>
           </w:tcPr>
           <w:p>
             <w:pPr>
@@ -11563,6 +11621,7 @@
         <w:tc>
           <w:tcPr>
             <w:tcW w:w="2542" w:type="dxa"/>
+            <w:vAlign w:val="center"/>
           </w:tcPr>
           <w:p>
             <w:pPr>
@@ -11588,6 +11647,7 @@
         <w:tc>
           <w:tcPr>
             <w:tcW w:w="3733" w:type="dxa"/>
+            <w:vAlign w:val="center"/>
           </w:tcPr>
           <w:p>
             <w:pPr>
@@ -11767,10 +11827,11 @@
         <w:tc>
           <w:tcPr>
             <w:tcW w:w="1329" w:type="dxa"/>
-          </w:tcPr>
-          <w:p>
-            <w:pPr>
-              <w:jc w:val="left"/>
+            <w:vAlign w:val="center"/>
+          </w:tcPr>
+          <w:p>
+            <w:pPr>
+              <w:jc w:val="center"/>
               <w:rPr>
                 <w:rFonts w:cstheme="majorHAnsi"/>
                 <w:b/>
@@ -11792,6 +11853,7 @@
         <w:tc>
           <w:tcPr>
             <w:tcW w:w="1485" w:type="dxa"/>
+            <w:vAlign w:val="center"/>
           </w:tcPr>
           <w:p>
             <w:pPr>
@@ -11817,6 +11879,7 @@
         <w:tc>
           <w:tcPr>
             <w:tcW w:w="2214" w:type="dxa"/>
+            <w:vAlign w:val="center"/>
           </w:tcPr>
           <w:p>
             <w:pPr>
@@ -11842,6 +11905,7 @@
         <w:tc>
           <w:tcPr>
             <w:tcW w:w="4146" w:type="dxa"/>
+            <w:vAlign w:val="center"/>
           </w:tcPr>
           <w:p>
             <w:pPr>
@@ -11869,10 +11933,11 @@
         <w:tc>
           <w:tcPr>
             <w:tcW w:w="1329" w:type="dxa"/>
-          </w:tcPr>
-          <w:p>
-            <w:pPr>
-              <w:jc w:val="left"/>
+            <w:vAlign w:val="center"/>
+          </w:tcPr>
+          <w:p>
+            <w:pPr>
+              <w:jc w:val="center"/>
               <w:rPr>
                 <w:rFonts w:cstheme="majorHAnsi"/>
                 <w:b/>
@@ -11894,6 +11959,7 @@
         <w:tc>
           <w:tcPr>
             <w:tcW w:w="1485" w:type="dxa"/>
+            <w:vAlign w:val="center"/>
           </w:tcPr>
           <w:p>
             <w:pPr>
@@ -11919,6 +11985,7 @@
         <w:tc>
           <w:tcPr>
             <w:tcW w:w="2214" w:type="dxa"/>
+            <w:vAlign w:val="center"/>
           </w:tcPr>
           <w:p>
             <w:pPr>
@@ -11944,6 +12011,7 @@
         <w:tc>
           <w:tcPr>
             <w:tcW w:w="4146" w:type="dxa"/>
+            <w:vAlign w:val="center"/>
           </w:tcPr>
           <w:p>
             <w:pPr>
@@ -11971,10 +12039,11 @@
         <w:tc>
           <w:tcPr>
             <w:tcW w:w="1329" w:type="dxa"/>
-          </w:tcPr>
-          <w:p>
-            <w:pPr>
-              <w:jc w:val="left"/>
+            <w:vAlign w:val="center"/>
+          </w:tcPr>
+          <w:p>
+            <w:pPr>
+              <w:jc w:val="center"/>
               <w:rPr>
                 <w:rFonts w:cstheme="majorHAnsi"/>
                 <w:b/>
@@ -11996,6 +12065,7 @@
         <w:tc>
           <w:tcPr>
             <w:tcW w:w="1485" w:type="dxa"/>
+            <w:vAlign w:val="center"/>
           </w:tcPr>
           <w:p>
             <w:pPr>
@@ -12021,6 +12091,7 @@
         <w:tc>
           <w:tcPr>
             <w:tcW w:w="2214" w:type="dxa"/>
+            <w:vAlign w:val="center"/>
           </w:tcPr>
           <w:p>
             <w:pPr>
@@ -12046,6 +12117,7 @@
         <w:tc>
           <w:tcPr>
             <w:tcW w:w="4146" w:type="dxa"/>
+            <w:vAlign w:val="center"/>
           </w:tcPr>
           <w:p>
             <w:pPr>
@@ -12073,10 +12145,11 @@
         <w:tc>
           <w:tcPr>
             <w:tcW w:w="1329" w:type="dxa"/>
-          </w:tcPr>
-          <w:p>
-            <w:pPr>
-              <w:jc w:val="left"/>
+            <w:vAlign w:val="center"/>
+          </w:tcPr>
+          <w:p>
+            <w:pPr>
+              <w:jc w:val="center"/>
               <w:rPr>
                 <w:rFonts w:cstheme="majorHAnsi"/>
                 <w:b/>
@@ -12098,6 +12171,7 @@
         <w:tc>
           <w:tcPr>
             <w:tcW w:w="1485" w:type="dxa"/>
+            <w:vAlign w:val="center"/>
           </w:tcPr>
           <w:p>
             <w:pPr>
@@ -12123,6 +12197,7 @@
         <w:tc>
           <w:tcPr>
             <w:tcW w:w="2214" w:type="dxa"/>
+            <w:vAlign w:val="center"/>
           </w:tcPr>
           <w:p>
             <w:pPr>
@@ -12148,6 +12223,7 @@
         <w:tc>
           <w:tcPr>
             <w:tcW w:w="4146" w:type="dxa"/>
+            <w:vAlign w:val="center"/>
           </w:tcPr>
           <w:p>
             <w:pPr>
@@ -12175,10 +12251,11 @@
         <w:tc>
           <w:tcPr>
             <w:tcW w:w="1329" w:type="dxa"/>
-          </w:tcPr>
-          <w:p>
-            <w:pPr>
-              <w:jc w:val="left"/>
+            <w:vAlign w:val="center"/>
+          </w:tcPr>
+          <w:p>
+            <w:pPr>
+              <w:jc w:val="center"/>
               <w:rPr>
                 <w:rFonts w:cstheme="majorHAnsi"/>
                 <w:b/>
@@ -12200,6 +12277,7 @@
         <w:tc>
           <w:tcPr>
             <w:tcW w:w="1485" w:type="dxa"/>
+            <w:vAlign w:val="center"/>
           </w:tcPr>
           <w:p>
             <w:pPr>
@@ -12225,6 +12303,7 @@
         <w:tc>
           <w:tcPr>
             <w:tcW w:w="2214" w:type="dxa"/>
+            <w:vAlign w:val="center"/>
           </w:tcPr>
           <w:p>
             <w:pPr>
@@ -12250,6 +12329,7 @@
         <w:tc>
           <w:tcPr>
             <w:tcW w:w="4146" w:type="dxa"/>
+            <w:vAlign w:val="center"/>
           </w:tcPr>
           <w:p>
             <w:pPr>
@@ -12432,10 +12512,11 @@
         <w:tc>
           <w:tcPr>
             <w:tcW w:w="1292" w:type="dxa"/>
-          </w:tcPr>
-          <w:p>
-            <w:pPr>
-              <w:jc w:val="left"/>
+            <w:vAlign w:val="center"/>
+          </w:tcPr>
+          <w:p>
+            <w:pPr>
+              <w:jc w:val="center"/>
               <w:rPr>
                 <w:rFonts w:cstheme="majorHAnsi"/>
                 <w:sz w:val="22"/>
@@ -12455,6 +12536,7 @@
         <w:tc>
           <w:tcPr>
             <w:tcW w:w="1485" w:type="dxa"/>
+            <w:vAlign w:val="center"/>
           </w:tcPr>
           <w:p>
             <w:pPr>
@@ -12478,6 +12560,7 @@
         <w:tc>
           <w:tcPr>
             <w:tcW w:w="2211" w:type="dxa"/>
+            <w:vAlign w:val="center"/>
           </w:tcPr>
           <w:p>
             <w:pPr>
@@ -12501,6 +12584,7 @@
         <w:tc>
           <w:tcPr>
             <w:tcW w:w="4186" w:type="dxa"/>
+            <w:vAlign w:val="center"/>
           </w:tcPr>
           <w:p>
             <w:pPr>
@@ -12526,10 +12610,11 @@
         <w:tc>
           <w:tcPr>
             <w:tcW w:w="1292" w:type="dxa"/>
-          </w:tcPr>
-          <w:p>
-            <w:pPr>
-              <w:jc w:val="left"/>
+            <w:vAlign w:val="center"/>
+          </w:tcPr>
+          <w:p>
+            <w:pPr>
+              <w:jc w:val="center"/>
               <w:rPr>
                 <w:rFonts w:cstheme="majorHAnsi"/>
                 <w:sz w:val="22"/>
@@ -12549,6 +12634,7 @@
         <w:tc>
           <w:tcPr>
             <w:tcW w:w="1485" w:type="dxa"/>
+            <w:vAlign w:val="center"/>
           </w:tcPr>
           <w:p>
             <w:pPr>
@@ -12572,6 +12658,7 @@
         <w:tc>
           <w:tcPr>
             <w:tcW w:w="2211" w:type="dxa"/>
+            <w:vAlign w:val="center"/>
           </w:tcPr>
           <w:p>
             <w:pPr>
@@ -12595,6 +12682,7 @@
         <w:tc>
           <w:tcPr>
             <w:tcW w:w="4186" w:type="dxa"/>
+            <w:vAlign w:val="center"/>
           </w:tcPr>
           <w:p>
             <w:pPr>
@@ -12620,10 +12708,11 @@
         <w:tc>
           <w:tcPr>
             <w:tcW w:w="1292" w:type="dxa"/>
-          </w:tcPr>
-          <w:p>
-            <w:pPr>
-              <w:jc w:val="left"/>
+            <w:vAlign w:val="center"/>
+          </w:tcPr>
+          <w:p>
+            <w:pPr>
+              <w:jc w:val="center"/>
               <w:rPr>
                 <w:rFonts w:cstheme="majorHAnsi"/>
                 <w:sz w:val="22"/>
@@ -12643,6 +12732,7 @@
         <w:tc>
           <w:tcPr>
             <w:tcW w:w="1485" w:type="dxa"/>
+            <w:vAlign w:val="center"/>
           </w:tcPr>
           <w:p>
             <w:pPr>
@@ -12666,6 +12756,7 @@
         <w:tc>
           <w:tcPr>
             <w:tcW w:w="2211" w:type="dxa"/>
+            <w:vAlign w:val="center"/>
           </w:tcPr>
           <w:p>
             <w:pPr>
@@ -12689,6 +12780,7 @@
         <w:tc>
           <w:tcPr>
             <w:tcW w:w="4186" w:type="dxa"/>
+            <w:vAlign w:val="center"/>
           </w:tcPr>
           <w:p>
             <w:pPr>
@@ -12714,10 +12806,11 @@
         <w:tc>
           <w:tcPr>
             <w:tcW w:w="1292" w:type="dxa"/>
-          </w:tcPr>
-          <w:p>
-            <w:pPr>
-              <w:jc w:val="left"/>
+            <w:vAlign w:val="center"/>
+          </w:tcPr>
+          <w:p>
+            <w:pPr>
+              <w:jc w:val="center"/>
               <w:rPr>
                 <w:rFonts w:cstheme="majorHAnsi"/>
                 <w:sz w:val="22"/>
@@ -12737,6 +12830,7 @@
         <w:tc>
           <w:tcPr>
             <w:tcW w:w="1485" w:type="dxa"/>
+            <w:vAlign w:val="center"/>
           </w:tcPr>
           <w:p>
             <w:pPr>
@@ -12760,6 +12854,7 @@
         <w:tc>
           <w:tcPr>
             <w:tcW w:w="2211" w:type="dxa"/>
+            <w:vAlign w:val="center"/>
           </w:tcPr>
           <w:p>
             <w:pPr>
@@ -12783,6 +12878,7 @@
         <w:tc>
           <w:tcPr>
             <w:tcW w:w="4186" w:type="dxa"/>
+            <w:vAlign w:val="center"/>
           </w:tcPr>
           <w:p>
             <w:pPr>
@@ -12808,10 +12904,11 @@
         <w:tc>
           <w:tcPr>
             <w:tcW w:w="1292" w:type="dxa"/>
-          </w:tcPr>
-          <w:p>
-            <w:pPr>
-              <w:jc w:val="left"/>
+            <w:vAlign w:val="center"/>
+          </w:tcPr>
+          <w:p>
+            <w:pPr>
+              <w:jc w:val="center"/>
               <w:rPr>
                 <w:rFonts w:cstheme="majorHAnsi"/>
                 <w:sz w:val="22"/>
@@ -12831,6 +12928,7 @@
         <w:tc>
           <w:tcPr>
             <w:tcW w:w="1485" w:type="dxa"/>
+            <w:vAlign w:val="center"/>
           </w:tcPr>
           <w:p>
             <w:pPr>
@@ -12854,6 +12952,7 @@
         <w:tc>
           <w:tcPr>
             <w:tcW w:w="2211" w:type="dxa"/>
+            <w:vAlign w:val="center"/>
           </w:tcPr>
           <w:p>
             <w:pPr>
@@ -12877,6 +12976,7 @@
         <w:tc>
           <w:tcPr>
             <w:tcW w:w="4186" w:type="dxa"/>
+            <w:vAlign w:val="center"/>
           </w:tcPr>
           <w:p>
             <w:pPr>
@@ -12902,10 +13002,11 @@
         <w:tc>
           <w:tcPr>
             <w:tcW w:w="1292" w:type="dxa"/>
-          </w:tcPr>
-          <w:p>
-            <w:pPr>
-              <w:jc w:val="left"/>
+            <w:vAlign w:val="center"/>
+          </w:tcPr>
+          <w:p>
+            <w:pPr>
+              <w:jc w:val="center"/>
               <w:rPr>
                 <w:rFonts w:cstheme="majorHAnsi"/>
                 <w:sz w:val="22"/>
@@ -12925,6 +13026,7 @@
         <w:tc>
           <w:tcPr>
             <w:tcW w:w="1485" w:type="dxa"/>
+            <w:vAlign w:val="center"/>
           </w:tcPr>
           <w:p>
             <w:pPr>
@@ -12948,6 +13050,7 @@
         <w:tc>
           <w:tcPr>
             <w:tcW w:w="2211" w:type="dxa"/>
+            <w:vAlign w:val="center"/>
           </w:tcPr>
           <w:p>
             <w:pPr>
@@ -12971,6 +13074,7 @@
         <w:tc>
           <w:tcPr>
             <w:tcW w:w="4186" w:type="dxa"/>
+            <w:vAlign w:val="center"/>
           </w:tcPr>
           <w:p>
             <w:pPr>
@@ -13103,6 +13207,7 @@
       <w:r>
         <w:rPr>
           <w:rFonts w:cstheme="majorHAnsi"/>
+          <w:noProof/>
           <w:lang w:val="en-US"/>
         </w:rPr>
         <w:lastRenderedPageBreak/>
@@ -13472,7 +13577,7 @@
                 <w:lang w:val="en-US"/>
                 <w14:ligatures w14:val="none"/>
               </w:rPr>
-              <w:t>Database Developer</w:t>
+              <w:t>Android Developer</w:t>
             </w:r>
             <w:r>
               <w:rPr>
@@ -13494,20 +13599,9 @@
                 <w:lang w:val="en-US"/>
                 <w14:ligatures w14:val="none"/>
               </w:rPr>
-              <w:t>Android Developer (Core)</w:t>
-            </w:r>
-          </w:p>
-        </w:tc>
-        <w:tc>
-          <w:tcPr>
-            <w:tcW w:w="4907" w:type="dxa"/>
-            <w:vAlign w:val="center"/>
-            <w:hideMark/>
-          </w:tcPr>
-          <w:p>
-            <w:pPr>
-              <w:spacing w:after="168"/>
-              <w:jc w:val="left"/>
+              <w:t>(UI/UX)</w:t>
+            </w:r>
+            <w:r>
               <w:rPr>
                 <w:rFonts w:eastAsia="Times New Roman" w:cstheme="majorHAnsi"/>
                 <w:kern w:val="0"/>
@@ -13516,7 +13610,8 @@
                 <w:lang w:val="en-US"/>
                 <w14:ligatures w14:val="none"/>
               </w:rPr>
-            </w:pPr>
+              <w:t>,</w:t>
+            </w:r>
             <w:r>
               <w:rPr>
                 <w:rFonts w:eastAsia="Times New Roman" w:cstheme="majorHAnsi"/>
@@ -13526,7 +13621,7 @@
                 <w:lang w:val="en-US"/>
                 <w14:ligatures w14:val="none"/>
               </w:rPr>
-              <w:t>Quản lý tiến độ dự án và phân chia công việc.</w:t>
+              <w:t xml:space="preserve"> </w:t>
             </w:r>
             <w:r>
               <w:rPr>
@@ -13537,9 +13632,19 @@
                 <w:lang w:val="en-US"/>
                 <w14:ligatures w14:val="none"/>
               </w:rPr>
-              <w:t xml:space="preserve"> </w:t>
-            </w:r>
-            <w:r>
+              <w:t>Reporter</w:t>
+            </w:r>
+          </w:p>
+        </w:tc>
+        <w:tc>
+          <w:tcPr>
+            <w:tcW w:w="4907" w:type="dxa"/>
+            <w:vAlign w:val="center"/>
+            <w:hideMark/>
+          </w:tcPr>
+          <w:p>
+            <w:pPr>
+              <w:spacing w:after="168"/>
               <w:rPr>
                 <w:rFonts w:eastAsia="Times New Roman" w:cstheme="majorHAnsi"/>
                 <w:kern w:val="0"/>
@@ -13548,95 +13653,16 @@
                 <w:lang w:val="en-US"/>
                 <w14:ligatures w14:val="none"/>
               </w:rPr>
-              <w:t xml:space="preserve">Thiết kế giao diện XML chuẩn Material Design 3 (14 màn </w:t>
-            </w:r>
+            </w:pPr>
             <w:r>
               <w:rPr>
                 <w:rFonts w:eastAsia="Times New Roman" w:cstheme="majorHAnsi"/>
                 <w:kern w:val="0"/>
                 <w:sz w:val="20"/>
                 <w:szCs w:val="20"/>
-                <w:lang w:val="en-US"/>
                 <w14:ligatures w14:val="none"/>
               </w:rPr>
-              <w:t xml:space="preserve"> </w:t>
-            </w:r>
-            <w:r>
-              <w:rPr>
-                <w:rFonts w:eastAsia="Times New Roman" w:cstheme="majorHAnsi"/>
-                <w:kern w:val="0"/>
-                <w:sz w:val="20"/>
-                <w:szCs w:val="20"/>
-                <w:lang w:val="en-US"/>
-                <w14:ligatures w14:val="none"/>
-              </w:rPr>
-              <w:t>hình).</w:t>
-            </w:r>
-            <w:r>
-              <w:rPr>
-                <w:rFonts w:eastAsia="Times New Roman" w:cstheme="majorHAnsi"/>
-                <w:kern w:val="0"/>
-                <w:sz w:val="20"/>
-                <w:szCs w:val="20"/>
-                <w:lang w:val="en-US"/>
-                <w14:ligatures w14:val="none"/>
-              </w:rPr>
-              <w:t xml:space="preserve"> </w:t>
-            </w:r>
-            <w:r>
-              <w:rPr>
-                <w:rFonts w:eastAsia="Times New Roman" w:cstheme="majorHAnsi"/>
-                <w:kern w:val="0"/>
-                <w:sz w:val="20"/>
-                <w:szCs w:val="20"/>
-                <w:lang w:val="en-US"/>
-                <w14:ligatures w14:val="none"/>
-              </w:rPr>
-              <w:t>Hiện thực RecyclerView Adapters, Context Menu (Sửa/Xóa).</w:t>
-            </w:r>
-            <w:r>
-              <w:rPr>
-                <w:rFonts w:eastAsia="Times New Roman" w:cstheme="majorHAnsi"/>
-                <w:kern w:val="0"/>
-                <w:sz w:val="20"/>
-                <w:szCs w:val="20"/>
-                <w:lang w:val="en-US"/>
-                <w14:ligatures w14:val="none"/>
-              </w:rPr>
-              <w:t xml:space="preserve"> </w:t>
-            </w:r>
-            <w:r>
-              <w:rPr>
-                <w:rFonts w:eastAsia="Times New Roman" w:cstheme="majorHAnsi"/>
-                <w:kern w:val="0"/>
-                <w:sz w:val="20"/>
-                <w:szCs w:val="20"/>
-                <w:lang w:val="en-US"/>
-                <w14:ligatures w14:val="none"/>
-              </w:rPr>
-              <w:t>Tích hợp thư viện MPAndroidChart vẽ biểu đồ xu hướng.</w:t>
-            </w:r>
-            <w:r>
-              <w:rPr>
-                <w:rFonts w:eastAsia="Times New Roman" w:cstheme="majorHAnsi"/>
-                <w:kern w:val="0"/>
-                <w:sz w:val="20"/>
-                <w:szCs w:val="20"/>
-                <w:lang w:val="en-US"/>
-                <w14:ligatures w14:val="none"/>
-              </w:rPr>
-              <w:t xml:space="preserve"> </w:t>
-            </w:r>
-            <w:r>
-              <w:rPr>
-                <w:rFonts w:eastAsia="Times New Roman" w:cstheme="majorHAnsi"/>
-                <w:kern w:val="0"/>
-                <w:sz w:val="20"/>
-                <w:szCs w:val="20"/>
-                <w:lang w:val="en-US"/>
-                <w14:ligatures w14:val="none"/>
-              </w:rPr>
-              <w:t>Lập trình tính toán BMI và xử lý logic giờ ngủ.</w:t>
+              <w:t>Quản lý tiến độ và phân chia công việc. Thiết kế giao diện XML theo Material Components cho 14 màn hình. Hiện thực RecyclerView Adapter và Context Menu (Sửa/Xóa). Tích hợp MPAndroidChart vẽ biểu đồ xu hướng. Lập trình tính BMI, logic giờ ngủ và gợi ý mục tiêu nước. Soạn báo cáo Word.</w:t>
             </w:r>
           </w:p>
         </w:tc>
@@ -13738,7 +13764,7 @@
                 <w:lang w:val="en-US"/>
                 <w14:ligatures w14:val="none"/>
               </w:rPr>
-              <w:t>Android Developer</w:t>
+              <w:t>Database Developer</w:t>
             </w:r>
             <w:r>
               <w:rPr>
@@ -13760,7 +13786,7 @@
                 <w:lang w:val="en-US"/>
                 <w14:ligatures w14:val="none"/>
               </w:rPr>
-              <w:t>(UI/UX)</w:t>
+              <w:t>Android Developer (Core)</w:t>
             </w:r>
             <w:r>
               <w:rPr>
@@ -13782,9 +13808,19 @@
                 <w:lang w:val="en-US"/>
                 <w14:ligatures w14:val="none"/>
               </w:rPr>
-              <w:t>Reporter</w:t>
-            </w:r>
-            <w:r>
+              <w:t>Presenter</w:t>
+            </w:r>
+          </w:p>
+        </w:tc>
+        <w:tc>
+          <w:tcPr>
+            <w:tcW w:w="4907" w:type="dxa"/>
+            <w:vAlign w:val="center"/>
+            <w:hideMark/>
+          </w:tcPr>
+          <w:p>
+            <w:pPr>
+              <w:spacing w:after="168"/>
               <w:rPr>
                 <w:rFonts w:eastAsia="Times New Roman" w:cstheme="majorHAnsi"/>
                 <w:kern w:val="0"/>
@@ -13793,138 +13829,16 @@
                 <w:lang w:val="en-US"/>
                 <w14:ligatures w14:val="none"/>
               </w:rPr>
-              <w:t xml:space="preserve">, </w:t>
-            </w:r>
+            </w:pPr>
             <w:r>
               <w:rPr>
                 <w:rFonts w:eastAsia="Times New Roman" w:cstheme="majorHAnsi"/>
                 <w:kern w:val="0"/>
                 <w:sz w:val="20"/>
                 <w:szCs w:val="20"/>
-                <w:lang w:val="en-US"/>
                 <w14:ligatures w14:val="none"/>
               </w:rPr>
-              <w:t>Presenter</w:t>
-            </w:r>
-          </w:p>
-        </w:tc>
-        <w:tc>
-          <w:tcPr>
-            <w:tcW w:w="4907" w:type="dxa"/>
-            <w:vAlign w:val="center"/>
-            <w:hideMark/>
-          </w:tcPr>
-          <w:p>
-            <w:pPr>
-              <w:spacing w:after="168"/>
-              <w:jc w:val="left"/>
-              <w:rPr>
-                <w:rFonts w:eastAsia="Times New Roman" w:cstheme="majorHAnsi"/>
-                <w:kern w:val="0"/>
-                <w:sz w:val="20"/>
-                <w:szCs w:val="20"/>
-                <w:lang w:val="en-US"/>
-                <w14:ligatures w14:val="none"/>
-              </w:rPr>
-            </w:pPr>
-            <w:r>
-              <w:rPr>
-                <w:rFonts w:eastAsia="Times New Roman" w:cstheme="majorHAnsi"/>
-                <w:kern w:val="0"/>
-                <w:sz w:val="20"/>
-                <w:szCs w:val="20"/>
-                <w:lang w:val="en-US"/>
-                <w14:ligatures w14:val="none"/>
-              </w:rPr>
-              <w:t>Thiết kế và hiện thực CSDL SQLite (6 bảng), tối ưu Index.</w:t>
-            </w:r>
-            <w:r>
-              <w:rPr>
-                <w:rFonts w:eastAsia="Times New Roman" w:cstheme="majorHAnsi"/>
-                <w:kern w:val="0"/>
-                <w:sz w:val="20"/>
-                <w:szCs w:val="20"/>
-                <w:lang w:val="en-US"/>
-                <w14:ligatures w14:val="none"/>
-              </w:rPr>
-              <w:t xml:space="preserve"> </w:t>
-            </w:r>
-            <w:r>
-              <w:rPr>
-                <w:rFonts w:eastAsia="Times New Roman" w:cstheme="majorHAnsi"/>
-                <w:kern w:val="0"/>
-                <w:sz w:val="20"/>
-                <w:szCs w:val="20"/>
-                <w:lang w:val="en-US"/>
-                <w14:ligatures w14:val="none"/>
-              </w:rPr>
-              <w:t>Lập trình xác thực tài khoản (SHA-256 + salt, SessionManager).</w:t>
-            </w:r>
-            <w:r>
-              <w:rPr>
-                <w:rFonts w:eastAsia="Times New Roman" w:cstheme="majorHAnsi"/>
-                <w:kern w:val="0"/>
-                <w:sz w:val="20"/>
-                <w:szCs w:val="20"/>
-                <w:lang w:val="en-US"/>
-                <w14:ligatures w14:val="none"/>
-              </w:rPr>
-              <w:t xml:space="preserve"> </w:t>
-            </w:r>
-            <w:r>
-              <w:rPr>
-                <w:rFonts w:eastAsia="Times New Roman" w:cstheme="majorHAnsi"/>
-                <w:kern w:val="0"/>
-                <w:sz w:val="20"/>
-                <w:szCs w:val="20"/>
-                <w:lang w:val="en-US"/>
-                <w14:ligatures w14:val="none"/>
-              </w:rPr>
-              <w:t>Hiện thực cơ chế báo thức (AlarmManager, BroadcastReceiver).</w:t>
-            </w:r>
-            <w:r>
-              <w:rPr>
-                <w:rFonts w:eastAsia="Times New Roman" w:cstheme="majorHAnsi"/>
-                <w:kern w:val="0"/>
-                <w:sz w:val="20"/>
-                <w:szCs w:val="20"/>
-                <w:lang w:val="en-US"/>
-                <w14:ligatures w14:val="none"/>
-              </w:rPr>
-              <w:t xml:space="preserve"> </w:t>
-            </w:r>
-            <w:r>
-              <w:rPr>
-                <w:rFonts w:eastAsia="Times New Roman" w:cstheme="majorHAnsi"/>
-                <w:kern w:val="0"/>
-                <w:sz w:val="20"/>
-                <w:szCs w:val="20"/>
-                <w:lang w:val="en-US"/>
-                <w14:ligatures w14:val="none"/>
-              </w:rPr>
-              <w:t>Xử lý đa luồng gọi REST API Open-Meteo (WeatherClient).</w:t>
-            </w:r>
-            <w:r>
-              <w:rPr>
-                <w:rFonts w:eastAsia="Times New Roman" w:cstheme="majorHAnsi"/>
-                <w:kern w:val="0"/>
-                <w:sz w:val="20"/>
-                <w:szCs w:val="20"/>
-                <w:lang w:val="en-US"/>
-                <w14:ligatures w14:val="none"/>
-              </w:rPr>
-              <w:t xml:space="preserve"> </w:t>
-            </w:r>
-            <w:r>
-              <w:rPr>
-                <w:rFonts w:eastAsia="Times New Roman" w:cstheme="majorHAnsi"/>
-                <w:kern w:val="0"/>
-                <w:sz w:val="20"/>
-                <w:szCs w:val="20"/>
-                <w:lang w:val="en-US"/>
-                <w14:ligatures w14:val="none"/>
-              </w:rPr>
-              <w:t>Soạn thảo báo cáo Word đồ án và trình bày thuyết trình (Demo).</w:t>
+              <w:t>Thiết kế và hiện thực CSDL SQLite (6 bảng, chỉ mục). Lập trình xác thực tài khoản (SHA-256 + salt, SessionManager). Hiện thực báo thức nhắc thuốc và nước (AlarmManager, BroadcastReceiver), gồm hủy và đặt lại báo thức khi sửa hoặc xóa thuốc. Xử lý đa luồng gọi API Open-Meteo (WeatherClient). Thuyết trình và demo.</w:t>
             </w:r>
           </w:p>
         </w:tc>
@@ -13975,6 +13889,95 @@
           <w:lang w:val="en-US"/>
         </w:rPr>
       </w:pPr>
+    </w:p>
+    <w:p>
+      <w:pPr>
+        <w:jc w:val="left"/>
+        <w:rPr>
+          <w:rFonts w:cstheme="majorHAnsi"/>
+          <w:b/>
+          <w:sz w:val="30"/>
+          <w:lang w:val="en-US"/>
+        </w:rPr>
+      </w:pPr>
+      <w:r>
+        <w:rPr>
+          <w:rFonts w:cstheme="majorHAnsi"/>
+          <w:b/>
+          <w:sz w:val="30"/>
+          <w:lang w:val="en-US"/>
+        </w:rPr>
+        <w:br w:type="page"/>
+      </w:r>
+    </w:p>
+    <w:p>
+      <w:pPr>
+        <w:rPr>
+          <w:lang w:val="en-US"/>
+        </w:rPr>
+      </w:pPr>
+      <w:r>
+        <w:rPr>
+          <w:lang w:val="en-US"/>
+        </w:rPr>
+        <w:lastRenderedPageBreak/>
+        <w:t>[1] World Health Organization, Adherence to Long-Term Therapies: Evidence for Action. Geneva, Switzerland: WHO, 2003.</w:t>
+      </w:r>
+    </w:p>
+    <w:p>
+      <w:pPr>
+        <w:rPr>
+          <w:lang w:val="en-US"/>
+        </w:rPr>
+      </w:pPr>
+      <w:r>
+        <w:rPr>
+          <w:lang w:val="en-US"/>
+        </w:rPr>
+        <w:t>[2] Open-Meteo, "Air Quality API," Open-Meteo.com. [Trực tuyến]. Có tại:</w:t>
+      </w:r>
+      <w:r>
+        <w:rPr>
+          <w:lang w:val="en-US"/>
+        </w:rPr>
+        <w:t xml:space="preserve"> </w:t>
+      </w:r>
+      <w:r>
+        <w:rPr>
+          <w:lang w:val="en-US"/>
+        </w:rPr>
+        <w:t xml:space="preserve">https://open-meteo.com/en/docs/air-quality-api. </w:t>
+      </w:r>
+      <w:r>
+        <w:rPr>
+          <w:lang w:val="en-US"/>
+        </w:rPr>
+        <w:t xml:space="preserve">[Truy cập: </w:t>
+      </w:r>
+      <w:r>
+        <w:rPr>
+          <w:lang w:val="en-US"/>
+        </w:rPr>
+        <w:t>8</w:t>
+      </w:r>
+      <w:r>
+        <w:rPr>
+          <w:lang w:val="en-US"/>
+        </w:rPr>
+        <w:t>/</w:t>
+      </w:r>
+      <w:r>
+        <w:rPr>
+          <w:lang w:val="en-US"/>
+        </w:rPr>
+        <w:t>9</w:t>
+      </w:r>
+      <w:r>
+        <w:rPr>
+          <w:lang w:val="en-US"/>
+        </w:rPr>
+        <w:t>/2026].</w:t>
+      </w:r>
     </w:p>
     <w:sectPr>
       <w:headerReference w:type="default" r:id="rId12"/>

</xml_diff>